<commit_message>
docs: retain latest operation steps
</commit_message>
<xml_diff>
--- a/操作步骤.docx
+++ b/操作步骤.docx
@@ -13,81 +13,7 @@
         <w:rPr>
           <w:rFonts w:hint="eastAsia"/>
         </w:rPr>
-        <w:t>sha256sum taijiagent-制包机输入-d063971e900a3184c767766fc9886088ae181150.tar.gz</w:t>
-      </w:r>
-    </w:p>
-    <w:p>
-      <w:pPr>
-        <w:jc w:val="left"/>
-        <w:rPr>
-          <w:rFonts w:hint="eastAsia"/>
-        </w:rPr>
-      </w:pPr>
-      <w:bookmarkStart w:id="0" w:name="_GoBack"/>
-      <w:bookmarkEnd w:id="0"/>
-    </w:p>
-    <w:p>
-      <w:pPr>
-        <w:jc w:val="left"/>
-        <w:rPr>
-          <w:rFonts w:hint="eastAsia"/>
-        </w:rPr>
-      </w:pPr>
-      <w:r>
-        <w:rPr>
-          <w:rFonts w:hint="eastAsia"/>
-        </w:rPr>
-        <w:t>mkdir -p /tmp/taiji-agent-delivery-d063971e</w:t>
-      </w:r>
-    </w:p>
-    <w:p>
-      <w:pPr>
-        <w:jc w:val="left"/>
-        <w:rPr>
-          <w:rFonts w:hint="eastAsia"/>
-        </w:rPr>
-      </w:pPr>
-      <w:r>
-        <w:rPr>
-          <w:rFonts w:hint="eastAsia"/>
-        </w:rPr>
-        <w:t>tar -xzf taijiagent-制包机输入-d063971e900a3184c767766fc9886088ae181150.tar.gz \</w:t>
-      </w:r>
-    </w:p>
-    <w:p>
-      <w:pPr>
-        <w:jc w:val="left"/>
-        <w:rPr>
-          <w:rFonts w:hint="eastAsia"/>
-        </w:rPr>
-      </w:pPr>
-      <w:r>
-        <w:rPr>
-          <w:rFonts w:hint="eastAsia"/>
-        </w:rPr>
-        <w:t xml:space="preserve">  -C /tmp/taiji-agent-delivery-d063971e</w:t>
-      </w:r>
-    </w:p>
-    <w:p>
-      <w:pPr>
-        <w:jc w:val="left"/>
-        <w:rPr>
-          <w:rFonts w:hint="eastAsia"/>
-        </w:rPr>
-      </w:pPr>
-    </w:p>
-    <w:p>
-      <w:pPr>
-        <w:jc w:val="left"/>
-        <w:rPr>
-          <w:rFonts w:hint="eastAsia"/>
-        </w:rPr>
-      </w:pPr>
-      <w:r>
-        <w:rPr>
-          <w:rFonts w:hint="eastAsia"/>
-        </w:rPr>
-        <w:t>cd "/tmp/taiji-agent-delivery-d063971e/taijiagent 打包交付"</w:t>
+        <w:t>cd "taijiagent 打包交付"</w:t>
       </w:r>
     </w:p>
     <w:p>
@@ -100,6 +26,8 @@
         </w:rPr>
         <w:t>bash ./00_制包机_生成离线交付包.sh</w:t>
       </w:r>
+      <w:bookmarkStart w:id="0" w:name="_GoBack"/>
+      <w:bookmarkEnd w:id="0"/>
     </w:p>
     <w:sectPr>
       <w:pgSz w:w="11906" w:h="16838"/>

</xml_diff>